<commit_message>
Coacreditados: dos cartas y constancia con el mismo numero, datos del trabajador dos y plantillas COAC
</commit_message>
<xml_diff>
--- a/backend/templates/COAC_CDMX_AP.docx
+++ b/backend/templates/COAC_CDMX_AP.docx
@@ -603,16 +603,15 @@
           <w:sz w:val="14"/>
           <w:szCs w:val="14"/>
         </w:rPr>
-        <w:t>DE LOS SEÑORES</w:t>
-      </w:r>
-      <w:r>
-        <w:rPr>
-          <w:rFonts w:ascii="Arial" w:hAnsi="Arial" w:cs="Arial"/>
-          <w:bCs/>
-          <w:sz w:val="14"/>
-          <w:szCs w:val="14"/>
-        </w:rPr>
-        <w:t xml:space="preserve"> </w:t>
+        <w:t>DE LOS SEÑORES {{ nombre_acreditado }} COMO EL “TRABAJADOR UNO” Y {{ nombre_acreditado_2 }} COMO EL</w:t>
+      </w:r>
+      <w:r>
+        <w:rPr>
+          <w:rFonts w:ascii="Arial" w:hAnsi="Arial" w:cs="Arial"/>
+          <w:bCs/>
+          <w:sz w:val="14"/>
+          <w:szCs w:val="14"/>
+        </w:rPr>
       </w:r>
       <w:bookmarkStart w:id="4" w:name="_Hlk178069492"/>
       <w:bookmarkStart w:id="5" w:name="_Hlk178074236"/>
@@ -623,25 +622,22 @@
           <w:sz w:val="14"/>
           <w:szCs w:val="14"/>
         </w:rPr>
-        <w:t xml:space="preserve">             </w:t>
-      </w:r>
-      <w:r>
-        <w:rPr>
-          <w:rFonts w:ascii="Arial" w:hAnsi="Arial" w:cs="Arial"/>
-          <w:bCs/>
-          <w:sz w:val="14"/>
-          <w:szCs w:val="14"/>
-        </w:rPr>
-        <w:t xml:space="preserve">COMO EL </w:t>
-      </w:r>
-      <w:r>
-        <w:rPr>
-          <w:rFonts w:ascii="Arial" w:hAnsi="Arial" w:cs="Arial"/>
-          <w:b/>
-          <w:sz w:val="14"/>
-          <w:szCs w:val="14"/>
-        </w:rPr>
-        <w:t xml:space="preserve">“TRABAJADOR UNO” </w:t>
+      </w:r>
+      <w:r>
+        <w:rPr>
+          <w:rFonts w:ascii="Arial" w:hAnsi="Arial" w:cs="Arial"/>
+          <w:bCs/>
+          <w:sz w:val="14"/>
+          <w:szCs w:val="14"/>
+        </w:rPr>
+      </w:r>
+      <w:r>
+        <w:rPr>
+          <w:rFonts w:ascii="Arial" w:hAnsi="Arial" w:cs="Arial"/>
+          <w:b/>
+          <w:sz w:val="14"/>
+          <w:szCs w:val="14"/>
+        </w:rPr>
       </w:r>
       <w:bookmarkEnd w:id="4"/>
       <w:r>
@@ -651,16 +647,14 @@
           <w:sz w:val="14"/>
           <w:szCs w:val="14"/>
         </w:rPr>
-        <w:t>Y</w:t>
-      </w:r>
-      <w:r>
-        <w:rPr>
-          <w:rFonts w:ascii="Arial" w:hAnsi="Arial" w:cs="Arial"/>
-          <w:b/>
-          <w:sz w:val="14"/>
-          <w:szCs w:val="14"/>
-        </w:rPr>
-        <w:t xml:space="preserve"> </w:t>
+      </w:r>
+      <w:r>
+        <w:rPr>
+          <w:rFonts w:ascii="Arial" w:hAnsi="Arial" w:cs="Arial"/>
+          <w:b/>
+          <w:sz w:val="14"/>
+          <w:szCs w:val="14"/>
+        </w:rPr>
       </w:r>
       <w:bookmarkStart w:id="6" w:name="_Hlk178069515"/>
       <w:bookmarkEnd w:id="5"/>
@@ -673,7 +667,6 @@
           <w:szCs w:val="14"/>
           <w:lang w:val="es-ES"/>
         </w:rPr>
-        <w:t xml:space="preserve">                                       </w:t>
       </w:r>
       <w:r>
         <w:rPr>
@@ -682,7 +675,7 @@
           <w:szCs w:val="14"/>
           <w:lang w:val="es-ES"/>
         </w:rPr>
-        <w:t xml:space="preserve">COMO EL </w:t>
+        <w:t xml:space="preserve"> </w:t>
       </w:r>
       <w:r>
         <w:rPr>
@@ -1475,63 +1468,56 @@
           <w:sz w:val="14"/>
           <w:szCs w:val="14"/>
         </w:rPr>
-        <w:t>i</w:t>
-      </w:r>
-      <w:r>
-        <w:rPr>
-          <w:rFonts w:ascii="Arial" w:eastAsia="Batang" w:hAnsi="Arial" w:cs="Arial"/>
-          <w:sz w:val="14"/>
-          <w:szCs w:val="14"/>
-        </w:rPr>
-        <w:t>nstrumento</w:t>
-      </w:r>
-      <w:r>
-        <w:rPr>
-          <w:rFonts w:ascii="Arial" w:eastAsia="Batang" w:hAnsi="Arial" w:cs="Arial"/>
-          <w:sz w:val="14"/>
-          <w:szCs w:val="14"/>
-        </w:rPr>
-        <w:t xml:space="preserve"> número</w:t>
-      </w:r>
-      <w:r>
-        <w:rPr>
-          <w:rFonts w:ascii="Arial" w:eastAsia="Batang" w:hAnsi="Arial" w:cs="Arial"/>
-          <w:sz w:val="14"/>
-          <w:szCs w:val="14"/>
-        </w:rPr>
-        <w:t xml:space="preserve">      </w:t>
-      </w:r>
-      <w:r>
-        <w:rPr>
-          <w:rFonts w:ascii="Arial" w:eastAsia="Batang" w:hAnsi="Arial" w:cs="Arial"/>
-          <w:sz w:val="14"/>
-          <w:szCs w:val="14"/>
-        </w:rPr>
-        <w:t>,</w:t>
-      </w:r>
-      <w:r>
-        <w:rPr>
-          <w:rFonts w:ascii="Arial" w:eastAsia="Batang" w:hAnsi="Arial" w:cs="Arial"/>
-          <w:sz w:val="14"/>
-          <w:szCs w:val="14"/>
-        </w:rPr>
-        <w:t xml:space="preserve"> </w:t>
-      </w:r>
-      <w:r>
-        <w:rPr>
-          <w:rFonts w:ascii="Arial" w:eastAsia="Batang" w:hAnsi="Arial" w:cs="Arial"/>
-          <w:sz w:val="14"/>
-          <w:szCs w:val="14"/>
-        </w:rPr>
-        <w:t>de fecha</w:t>
-      </w:r>
-      <w:r>
-        <w:rPr>
-          <w:rFonts w:ascii="Arial" w:eastAsia="Batang" w:hAnsi="Arial" w:cs="Arial"/>
-          <w:sz w:val="14"/>
-          <w:szCs w:val="14"/>
-        </w:rPr>
-        <w:t xml:space="preserve">   </w:t>
+        <w:t>instrumento número {{ numero_escritura }}, de fecha {{ fecha_escritura }}, otorgado ante la fe {{ notario_origen_completo }},</w:t>
+      </w:r>
+      <w:r>
+        <w:rPr>
+          <w:rFonts w:ascii="Arial" w:eastAsia="Batang" w:hAnsi="Arial" w:cs="Arial"/>
+          <w:sz w:val="14"/>
+          <w:szCs w:val="14"/>
+        </w:rPr>
+      </w:r>
+      <w:r>
+        <w:rPr>
+          <w:rFonts w:ascii="Arial" w:eastAsia="Batang" w:hAnsi="Arial" w:cs="Arial"/>
+          <w:sz w:val="14"/>
+          <w:szCs w:val="14"/>
+        </w:rPr>
+      </w:r>
+      <w:r>
+        <w:rPr>
+          <w:rFonts w:ascii="Arial" w:eastAsia="Batang" w:hAnsi="Arial" w:cs="Arial"/>
+          <w:sz w:val="14"/>
+          <w:szCs w:val="14"/>
+        </w:rPr>
+      </w:r>
+      <w:r>
+        <w:rPr>
+          <w:rFonts w:ascii="Arial" w:eastAsia="Batang" w:hAnsi="Arial" w:cs="Arial"/>
+          <w:sz w:val="14"/>
+          <w:szCs w:val="14"/>
+        </w:rPr>
+      </w:r>
+      <w:r>
+        <w:rPr>
+          <w:rFonts w:ascii="Arial" w:eastAsia="Batang" w:hAnsi="Arial" w:cs="Arial"/>
+          <w:sz w:val="14"/>
+          <w:szCs w:val="14"/>
+        </w:rPr>
+      </w:r>
+      <w:r>
+        <w:rPr>
+          <w:rFonts w:ascii="Arial" w:eastAsia="Batang" w:hAnsi="Arial" w:cs="Arial"/>
+          <w:sz w:val="14"/>
+          <w:szCs w:val="14"/>
+        </w:rPr>
+      </w:r>
+      <w:r>
+        <w:rPr>
+          <w:rFonts w:ascii="Arial" w:eastAsia="Batang" w:hAnsi="Arial" w:cs="Arial"/>
+          <w:sz w:val="14"/>
+          <w:szCs w:val="14"/>
+        </w:rPr>
       </w:r>
       <w:bookmarkStart w:id="7" w:name="_Hlk150194100"/>
       <w:r>
@@ -1540,23 +1526,20 @@
           <w:sz w:val="14"/>
           <w:szCs w:val="14"/>
         </w:rPr>
-        <w:t xml:space="preserve"> </w:t>
-      </w:r>
-      <w:r>
-        <w:rPr>
-          <w:rFonts w:ascii="Arial" w:eastAsia="Batang" w:hAnsi="Arial" w:cs="Arial"/>
-          <w:sz w:val="14"/>
-          <w:szCs w:val="14"/>
-        </w:rPr>
-        <w:t>,</w:t>
-      </w:r>
-      <w:r>
-        <w:rPr>
-          <w:rFonts w:ascii="Arial" w:eastAsia="Batang" w:hAnsi="Arial" w:cs="Arial"/>
-          <w:sz w:val="14"/>
-          <w:szCs w:val="14"/>
-        </w:rPr>
-        <w:t xml:space="preserve"> </w:t>
+      </w:r>
+      <w:r>
+        <w:rPr>
+          <w:rFonts w:ascii="Arial" w:eastAsia="Batang" w:hAnsi="Arial" w:cs="Arial"/>
+          <w:sz w:val="14"/>
+          <w:szCs w:val="14"/>
+        </w:rPr>
+      </w:r>
+      <w:r>
+        <w:rPr>
+          <w:rFonts w:ascii="Arial" w:eastAsia="Batang" w:hAnsi="Arial" w:cs="Arial"/>
+          <w:sz w:val="14"/>
+          <w:szCs w:val="14"/>
+        </w:rPr>
       </w:r>
       <w:r>
         <w:rPr>
@@ -1565,7 +1548,6 @@
           <w:szCs w:val="14"/>
           <w:lang w:val="es-ES"/>
         </w:rPr>
-        <w:t>otorgado ante</w:t>
       </w:r>
       <w:bookmarkEnd w:id="7"/>
       <w:r>
@@ -1575,7 +1557,6 @@
           <w:szCs w:val="14"/>
           <w:lang w:val="es-ES"/>
         </w:rPr>
-        <w:t xml:space="preserve"> la fe del Licenciado</w:t>
       </w:r>
       <w:r>
         <w:rPr>
@@ -1584,15 +1565,13 @@
           <w:szCs w:val="14"/>
           <w:lang w:val="es-ES"/>
         </w:rPr>
-        <w:t xml:space="preserve">                                                </w:t>
-      </w:r>
-      <w:r>
-        <w:rPr>
-          <w:rFonts w:ascii="Arial" w:eastAsia="Batang" w:hAnsi="Arial" w:cs="Arial"/>
-          <w:sz w:val="14"/>
-          <w:szCs w:val="14"/>
-        </w:rPr>
-        <w:t>,</w:t>
+      </w:r>
+      <w:r>
+        <w:rPr>
+          <w:rFonts w:ascii="Arial" w:eastAsia="Batang" w:hAnsi="Arial" w:cs="Arial"/>
+          <w:sz w:val="14"/>
+          <w:szCs w:val="14"/>
+        </w:rPr>
       </w:r>
       <w:r>
         <w:rPr>
@@ -1859,7 +1838,7 @@
           <w:szCs w:val="14"/>
           <w:lang w:val="es-MX"/>
         </w:rPr>
-        <w:t xml:space="preserve"> </w:t>
+        <w:t xml:space="preserve"> hasta por {{ credito_a_salario }} veces</w:t>
       </w:r>
       <w:bookmarkEnd w:id="10"/>
       <w:bookmarkEnd w:id="11"/>
@@ -1871,7 +1850,6 @@
           <w:szCs w:val="14"/>
           <w:lang w:val="es-MX"/>
         </w:rPr>
-        <w:t>hasta</w:t>
       </w:r>
       <w:r>
         <w:rPr>
@@ -1883,123 +1861,116 @@
           <w:szCs w:val="14"/>
           <w:lang w:val="es-MX"/>
         </w:rPr>
+      </w:r>
+      <w:r>
+        <w:rPr>
+          <w:rFonts w:ascii="Arial" w:eastAsia="Batang" w:hAnsi="Arial" w:cs="Arial"/>
+          <w:sz w:val="14"/>
+          <w:szCs w:val="14"/>
+        </w:rPr>
+      </w:r>
+      <w:r>
+        <w:rPr>
+          <w:rFonts w:ascii="Arial" w:eastAsia="Batang" w:hAnsi="Arial" w:cs="Arial"/>
+          <w:sz w:val="14"/>
+          <w:szCs w:val="14"/>
+        </w:rPr>
+      </w:r>
+      <w:r>
+        <w:rPr>
+          <w:rFonts w:ascii="Arial" w:eastAsia="Batang" w:hAnsi="Arial" w:cs="Arial"/>
+          <w:iCs/>
+          <w:sz w:val="14"/>
+          <w:szCs w:val="14"/>
+          <w:lang w:val="es-MX"/>
+        </w:rPr>
+      </w:r>
+      <w:r>
+        <w:rPr>
+          <w:rFonts w:ascii="Arial" w:eastAsia="Batang" w:hAnsi="Arial" w:cs="Arial"/>
+          <w:sz w:val="14"/>
+          <w:szCs w:val="14"/>
+        </w:rPr>
+        <w:t xml:space="preserve"> el salario mínimo mensual vigente en ese entonces en el Distrito Federal</w:t>
+      </w:r>
+      <w:r>
+        <w:rPr>
+          <w:rFonts w:ascii="Arial" w:eastAsia="Batang" w:hAnsi="Arial" w:cs="Arial"/>
+          <w:b/>
+          <w:bCs/>
+          <w:iCs/>
+          <w:sz w:val="14"/>
+          <w:szCs w:val="14"/>
+          <w:lang w:val="es-MX"/>
+        </w:rPr>
+        <w:t xml:space="preserve">, </w:t>
+      </w:r>
+      <w:r>
+        <w:rPr>
+          <w:rFonts w:ascii="Arial" w:eastAsia="Batang" w:hAnsi="Arial" w:cs="Arial"/>
+          <w:iCs/>
+          <w:sz w:val="14"/>
+          <w:szCs w:val="14"/>
+          <w:lang w:val="es-MX"/>
+        </w:rPr>
+        <w:t xml:space="preserve">equivalente a esa fecha a la cantidad de </w:t>
+      </w:r>
+      <w:r>
+        <w:rPr>
+          <w:rFonts w:ascii="Arial" w:eastAsia="Batang" w:hAnsi="Arial" w:cs="Arial"/>
+          <w:b/>
+          <w:bCs/>
+          <w:iCs/>
+          <w:sz w:val="14"/>
+          <w:szCs w:val="14"/>
+          <w:lang w:val="es-MX"/>
+        </w:rPr>
+        <w:t>{{ monto_credito }}</w:t>
+      </w:r>
+      <w:r>
+        <w:rPr>
+          <w:rFonts w:ascii="Arial" w:eastAsia="Batang" w:hAnsi="Arial" w:cs="Arial"/>
+          <w:b/>
+          <w:bCs/>
+          <w:iCs/>
+          <w:sz w:val="14"/>
+          <w:szCs w:val="14"/>
+          <w:lang w:val="es-MX"/>
+        </w:rPr>
+      </w:r>
+      <w:r>
+        <w:rPr>
+          <w:rFonts w:ascii="Arial" w:eastAsia="Batang" w:hAnsi="Arial" w:cs="Arial"/>
+          <w:b/>
+          <w:bCs/>
+          <w:iCs/>
+          <w:sz w:val="14"/>
+          <w:szCs w:val="14"/>
+          <w:lang w:val="es-MX"/>
+        </w:rPr>
+      </w:r>
+      <w:r>
+        <w:rPr>
+          <w:rFonts w:ascii="Arial" w:eastAsia="Batang" w:hAnsi="Arial" w:cs="Arial"/>
+          <w:b/>
+          <w:bCs/>
+          <w:iCs/>
+          <w:sz w:val="14"/>
+          <w:szCs w:val="14"/>
+          <w:lang w:val="es-MX"/>
+        </w:rPr>
+      </w:r>
+      <w:r>
+        <w:rPr>
+          <w:rFonts w:ascii="Arial" w:eastAsia="Batang" w:hAnsi="Arial" w:cs="Arial"/>
+          <w:b/>
+          <w:bCs/>
+          <w:iCs/>
+          <w:sz w:val="14"/>
+          <w:szCs w:val="14"/>
+          <w:lang w:val="es-MX"/>
+        </w:rPr>
         <w:t xml:space="preserve"> </w:t>
-      </w:r>
-      <w:r>
-        <w:rPr>
-          <w:rFonts w:ascii="Arial" w:eastAsia="Batang" w:hAnsi="Arial" w:cs="Arial"/>
-          <w:sz w:val="14"/>
-          <w:szCs w:val="14"/>
-        </w:rPr>
-        <w:t>por</w:t>
-      </w:r>
-      <w:r>
-        <w:rPr>
-          <w:rFonts w:ascii="Arial" w:eastAsia="Batang" w:hAnsi="Arial" w:cs="Arial"/>
-          <w:sz w:val="14"/>
-          <w:szCs w:val="14"/>
-        </w:rPr>
-        <w:t xml:space="preserve"> </w:t>
-      </w:r>
-      <w:r>
-        <w:rPr>
-          <w:rFonts w:ascii="Arial" w:eastAsia="Batang" w:hAnsi="Arial" w:cs="Arial"/>
-          <w:iCs/>
-          <w:sz w:val="14"/>
-          <w:szCs w:val="14"/>
-          <w:lang w:val="es-MX"/>
-        </w:rPr>
-        <w:t xml:space="preserve">                                </w:t>
-      </w:r>
-      <w:r>
-        <w:rPr>
-          <w:rFonts w:ascii="Arial" w:eastAsia="Batang" w:hAnsi="Arial" w:cs="Arial"/>
-          <w:sz w:val="14"/>
-          <w:szCs w:val="14"/>
-        </w:rPr>
-        <w:t>veces el salario mínimo mensual vigente en ese entonces en el Distrito Federal</w:t>
-      </w:r>
-      <w:r>
-        <w:rPr>
-          <w:rFonts w:ascii="Arial" w:eastAsia="Batang" w:hAnsi="Arial" w:cs="Arial"/>
-          <w:b/>
-          <w:bCs/>
-          <w:iCs/>
-          <w:sz w:val="14"/>
-          <w:szCs w:val="14"/>
-          <w:lang w:val="es-MX"/>
-        </w:rPr>
-        <w:t xml:space="preserve">, </w:t>
-      </w:r>
-      <w:r>
-        <w:rPr>
-          <w:rFonts w:ascii="Arial" w:eastAsia="Batang" w:hAnsi="Arial" w:cs="Arial"/>
-          <w:iCs/>
-          <w:sz w:val="14"/>
-          <w:szCs w:val="14"/>
-          <w:lang w:val="es-MX"/>
-        </w:rPr>
-        <w:t xml:space="preserve">equivalente a esa fecha a la cantidad de </w:t>
-      </w:r>
-      <w:r>
-        <w:rPr>
-          <w:rFonts w:ascii="Arial" w:eastAsia="Batang" w:hAnsi="Arial" w:cs="Arial"/>
-          <w:b/>
-          <w:bCs/>
-          <w:iCs/>
-          <w:sz w:val="14"/>
-          <w:szCs w:val="14"/>
-          <w:lang w:val="es-MX"/>
-        </w:rPr>
-        <w:t>$</w:t>
-      </w:r>
-      <w:r>
-        <w:rPr>
-          <w:rFonts w:ascii="Arial" w:eastAsia="Batang" w:hAnsi="Arial" w:cs="Arial"/>
-          <w:b/>
-          <w:bCs/>
-          <w:iCs/>
-          <w:sz w:val="14"/>
-          <w:szCs w:val="14"/>
-          <w:lang w:val="es-MX"/>
-        </w:rPr>
-        <w:t xml:space="preserve">              </w:t>
-      </w:r>
-      <w:r>
-        <w:rPr>
-          <w:rFonts w:ascii="Arial" w:eastAsia="Batang" w:hAnsi="Arial" w:cs="Arial"/>
-          <w:b/>
-          <w:bCs/>
-          <w:iCs/>
-          <w:sz w:val="14"/>
-          <w:szCs w:val="14"/>
-          <w:lang w:val="es-MX"/>
-        </w:rPr>
-        <w:t>M.N. (</w:t>
-      </w:r>
-      <w:r>
-        <w:rPr>
-          <w:rFonts w:ascii="Arial" w:eastAsia="Batang" w:hAnsi="Arial" w:cs="Arial"/>
-          <w:b/>
-          <w:bCs/>
-          <w:iCs/>
-          <w:sz w:val="14"/>
-          <w:szCs w:val="14"/>
-          <w:lang w:val="es-MX"/>
-        </w:rPr>
-        <w:t xml:space="preserve">                        </w:t>
-      </w:r>
-      <w:r>
-        <w:rPr>
-          <w:rFonts w:ascii="Arial" w:eastAsia="Batang" w:hAnsi="Arial" w:cs="Arial"/>
-          <w:b/>
-          <w:bCs/>
-          <w:iCs/>
-          <w:sz w:val="14"/>
-          <w:szCs w:val="14"/>
-          <w:lang w:val="es-MX"/>
-        </w:rPr>
-        <w:t xml:space="preserve">, MONEDA NACIONAL) </w:t>
       </w:r>
       <w:bookmarkStart w:id="12" w:name="_Hlk178072044"/>
       <w:bookmarkStart w:id="13" w:name="_Hlk178074371"/>
@@ -2069,7 +2040,7 @@
           <w:szCs w:val="14"/>
           <w:lang w:val="es-MX"/>
         </w:rPr>
-        <w:t xml:space="preserve"> </w:t>
+        <w:t xml:space="preserve"> hasta por {{ credito_a_salario_2 }} veces</w:t>
       </w:r>
       <w:bookmarkEnd w:id="12"/>
       <w:bookmarkEnd w:id="14"/>
@@ -2081,7 +2052,6 @@
           <w:szCs w:val="14"/>
           <w:lang w:val="es-MX"/>
         </w:rPr>
-        <w:t>hasta</w:t>
       </w:r>
       <w:r>
         <w:rPr>
@@ -2091,7 +2061,6 @@
           <w:szCs w:val="14"/>
           <w:lang w:val="es-MX"/>
         </w:rPr>
-        <w:t xml:space="preserve"> por </w:t>
       </w:r>
       <w:bookmarkEnd w:id="13"/>
       <w:bookmarkEnd w:id="15"/>
@@ -2101,15 +2070,14 @@
           <w:sz w:val="14"/>
           <w:szCs w:val="14"/>
         </w:rPr>
-        <w:t xml:space="preserve">                 </w:t>
-      </w:r>
-      <w:r>
-        <w:rPr>
-          <w:rFonts w:ascii="Arial" w:eastAsia="Batang" w:hAnsi="Arial" w:cs="Arial"/>
-          <w:sz w:val="14"/>
-          <w:szCs w:val="14"/>
-        </w:rPr>
-        <w:t>veces el salario mínimo mensual vigente en ese entonces</w:t>
+      </w:r>
+      <w:r>
+        <w:rPr>
+          <w:rFonts w:ascii="Arial" w:eastAsia="Batang" w:hAnsi="Arial" w:cs="Arial"/>
+          <w:sz w:val="14"/>
+          <w:szCs w:val="14"/>
+        </w:rPr>
+        <w:t xml:space="preserve"> el salario mínimo mensual vigente en ese entonces</w:t>
       </w:r>
       <w:r>
         <w:rPr>
@@ -2151,7 +2119,7 @@
           <w:szCs w:val="14"/>
           <w:lang w:val="es-MX"/>
         </w:rPr>
-        <w:t>$</w:t>
+        <w:t>{{ monto_credito_2 }}</w:t>
       </w:r>
       <w:r>
         <w:rPr>
@@ -2163,7 +2131,6 @@
           <w:szCs w:val="14"/>
           <w:lang w:val="es-MX"/>
         </w:rPr>
-        <w:t xml:space="preserve">            </w:t>
       </w:r>
       <w:r>
         <w:rPr>
@@ -2175,7 +2142,6 @@
           <w:szCs w:val="14"/>
           <w:lang w:val="es-MX"/>
         </w:rPr>
-        <w:t>M.N. (</w:t>
       </w:r>
       <w:r>
         <w:rPr>
@@ -2187,7 +2153,6 @@
           <w:szCs w:val="14"/>
           <w:lang w:val="es-MX"/>
         </w:rPr>
-        <w:t xml:space="preserve">                    </w:t>
       </w:r>
       <w:r>
         <w:rPr>
@@ -2199,7 +2164,6 @@
           <w:szCs w:val="14"/>
           <w:lang w:val="es-MX"/>
         </w:rPr>
-        <w:t>, MONEDA NACIONAL)</w:t>
       </w:r>
       <w:r>
         <w:rPr>
@@ -2482,7 +2446,7 @@
           <w:sz w:val="14"/>
           <w:szCs w:val="14"/>
         </w:rPr>
-        <w:t xml:space="preserve">                                                                    </w:t>
+        <w:t xml:space="preserve"> {{ datos_inmueble }}</w:t>
       </w:r>
       <w:r>
         <w:rPr>
@@ -2625,7 +2589,7 @@
           <w:szCs w:val="14"/>
           <w:lang w:val="es-MX"/>
         </w:rPr>
-        <w:t xml:space="preserve">.- El instrumento antes relacionado se encuentra inscrito en el Registro Público de la Propiedad y de Comercio de la Ciudad de México, en el Folio Real número </w:t>
+        <w:t>.- El instrumento antes relacionado se encuentra inscrito en el Registro Público de la Propiedad y de Comercio de la Ciudad de México, en el Folio Real número {{ folio_real }}</w:t>
       </w:r>
       <w:r>
         <w:rPr>
@@ -2636,7 +2600,7 @@
           <w:szCs w:val="14"/>
           <w:lang w:val="es-MX"/>
         </w:rPr>
-        <w:t>“                    ” (                    ), Auxiliar “    ” (       ).</w:t>
+        <w:t>, Auxiliar “    ” (       ).</w:t>
       </w:r>
       <w:r>
         <w:rPr>
@@ -2706,23 +2670,22 @@
           <w:sz w:val="14"/>
           <w:szCs w:val="14"/>
         </w:rPr>
-        <w:t>Con fecha</w:t>
-      </w:r>
-      <w:r>
-        <w:rPr>
-          <w:rFonts w:ascii="Arial" w:hAnsi="Arial" w:cs="Arial"/>
-          <w:sz w:val="14"/>
-          <w:szCs w:val="14"/>
-        </w:rPr>
-        <w:t xml:space="preserve">                                 </w:t>
-      </w:r>
-      <w:r>
-        <w:rPr>
-          <w:rFonts w:ascii="Arial" w:hAnsi="Arial" w:cs="Arial"/>
-          <w:sz w:val="14"/>
-          <w:szCs w:val="14"/>
-        </w:rPr>
-        <w:t xml:space="preserve">, el </w:t>
+        <w:t>Con fecha {{ fecha_expedicion }},</w:t>
+      </w:r>
+      <w:r>
+        <w:rPr>
+          <w:rFonts w:ascii="Arial" w:hAnsi="Arial" w:cs="Arial"/>
+          <w:sz w:val="14"/>
+          <w:szCs w:val="14"/>
+        </w:rPr>
+      </w:r>
+      <w:r>
+        <w:rPr>
+          <w:rFonts w:ascii="Arial" w:hAnsi="Arial" w:cs="Arial"/>
+          <w:sz w:val="14"/>
+          <w:szCs w:val="14"/>
+        </w:rPr>
+        <w:t xml:space="preserve"> el </w:t>
       </w:r>
       <w:r>
         <w:rPr>
@@ -2747,31 +2710,80 @@
           <w:sz w:val="14"/>
           <w:szCs w:val="14"/>
         </w:rPr>
-        <w:t xml:space="preserve"> el número </w:t>
-      </w:r>
-      <w:r>
-        <w:rPr>
-          <w:rFonts w:ascii="Arial" w:hAnsi="Arial" w:cs="Arial"/>
-          <w:sz w:val="14"/>
-          <w:szCs w:val="14"/>
-        </w:rPr>
-        <w:t>“</w:t>
-      </w:r>
-      <w:r>
-        <w:rPr>
-          <w:rFonts w:ascii="Arial" w:hAnsi="Arial" w:cs="Arial"/>
-          <w:sz w:val="14"/>
-          <w:szCs w:val="14"/>
-        </w:rPr>
-        <w:t xml:space="preserve">                   </w:t>
-      </w:r>
-      <w:r>
-        <w:rPr>
-          <w:rFonts w:ascii="Arial" w:hAnsi="Arial" w:cs="Arial"/>
-          <w:sz w:val="14"/>
-          <w:szCs w:val="14"/>
-        </w:rPr>
-        <w:t>”</w:t>
+        <w:t xml:space="preserve"> el número {{ numero_carta }}</w:t>
+      </w:r>
+      <w:r>
+        <w:rPr>
+          <w:rFonts w:ascii="Arial" w:hAnsi="Arial" w:cs="Arial"/>
+          <w:sz w:val="14"/>
+          <w:szCs w:val="14"/>
+        </w:rPr>
+      </w:r>
+      <w:r>
+        <w:rPr>
+          <w:rFonts w:ascii="Arial" w:hAnsi="Arial" w:cs="Arial"/>
+          <w:sz w:val="14"/>
+          <w:szCs w:val="14"/>
+        </w:rPr>
+      </w:r>
+      <w:r>
+        <w:rPr>
+          <w:rFonts w:ascii="Arial" w:hAnsi="Arial" w:cs="Arial"/>
+          <w:sz w:val="14"/>
+          <w:szCs w:val="14"/>
+        </w:rPr>
+      </w:r>
+      <w:r>
+        <w:rPr>
+          <w:rFonts w:ascii="Arial" w:hAnsi="Arial" w:cs="Arial"/>
+          <w:sz w:val="14"/>
+          <w:szCs w:val="14"/>
+        </w:rPr>
+      </w:r>
+      <w:r>
+        <w:rPr>
+          <w:rFonts w:ascii="Arial" w:hAnsi="Arial" w:cs="Arial"/>
+          <w:sz w:val="14"/>
+          <w:szCs w:val="14"/>
+        </w:rPr>
+      </w:r>
+      <w:r>
+        <w:rPr>
+          <w:rFonts w:ascii="Arial" w:hAnsi="Arial" w:cs="Arial"/>
+          <w:sz w:val="14"/>
+          <w:szCs w:val="14"/>
+        </w:rPr>
+      </w:r>
+      <w:r>
+        <w:rPr>
+          <w:rFonts w:ascii="Arial" w:hAnsi="Arial" w:cs="Arial"/>
+          <w:sz w:val="14"/>
+          <w:szCs w:val="14"/>
+        </w:rPr>
+      </w:r>
+      <w:r>
+        <w:rPr>
+          <w:rFonts w:ascii="Arial" w:hAnsi="Arial" w:cs="Arial"/>
+          <w:sz w:val="14"/>
+          <w:szCs w:val="14"/>
+        </w:rPr>
+        <w:t>,</w:t>
+      </w:r>
+      <w:r>
+        <w:rPr>
+          <w:rFonts w:ascii="Arial" w:hAnsi="Arial" w:cs="Arial"/>
+          <w:sz w:val="14"/>
+          <w:szCs w:val="14"/>
+        </w:rPr>
+        <w:t xml:space="preserve"> al suscrito Notario para la realización del presente instrumento </w:t>
+      </w:r>
+      <w:r>
+        <w:rPr>
+          <w:rFonts w:ascii="Arial" w:hAnsi="Arial" w:cs="Arial"/>
+          <w:sz w:val="14"/>
+          <w:szCs w:val="14"/>
+        </w:rPr>
+        <w:t>en donde se menciona que el crédito relacionado en el antecedente uno romano de este instrumento</w:t>
       </w:r>
       <w:r>
         <w:rPr>
@@ -2787,62 +2799,6 @@
           <w:sz w:val="14"/>
           <w:szCs w:val="14"/>
         </w:rPr>
-        <w:t>(</w:t>
-      </w:r>
-      <w:r>
-        <w:rPr>
-          <w:rFonts w:ascii="Arial" w:hAnsi="Arial" w:cs="Arial"/>
-          <w:sz w:val="14"/>
-          <w:szCs w:val="14"/>
-        </w:rPr>
-        <w:t xml:space="preserve">                                         </w:t>
-      </w:r>
-      <w:r>
-        <w:rPr>
-          <w:rFonts w:ascii="Arial" w:hAnsi="Arial" w:cs="Arial"/>
-          <w:sz w:val="14"/>
-          <w:szCs w:val="14"/>
-        </w:rPr>
-        <w:t>)</w:t>
-      </w:r>
-      <w:r>
-        <w:rPr>
-          <w:rFonts w:ascii="Arial" w:hAnsi="Arial" w:cs="Arial"/>
-          <w:sz w:val="14"/>
-          <w:szCs w:val="14"/>
-        </w:rPr>
-        <w:t>,</w:t>
-      </w:r>
-      <w:r>
-        <w:rPr>
-          <w:rFonts w:ascii="Arial" w:hAnsi="Arial" w:cs="Arial"/>
-          <w:sz w:val="14"/>
-          <w:szCs w:val="14"/>
-        </w:rPr>
-        <w:t xml:space="preserve"> al suscrito Notario para la realización del presente instrumento </w:t>
-      </w:r>
-      <w:r>
-        <w:rPr>
-          <w:rFonts w:ascii="Arial" w:hAnsi="Arial" w:cs="Arial"/>
-          <w:sz w:val="14"/>
-          <w:szCs w:val="14"/>
-        </w:rPr>
-        <w:t>en donde se menciona que el crédito relacionado en el antecedente uno romano de este instrumento</w:t>
-      </w:r>
-      <w:r>
-        <w:rPr>
-          <w:rFonts w:ascii="Arial" w:hAnsi="Arial" w:cs="Arial"/>
-          <w:sz w:val="14"/>
-          <w:szCs w:val="14"/>
-        </w:rPr>
-        <w:t xml:space="preserve"> </w:t>
-      </w:r>
-      <w:r>
-        <w:rPr>
-          <w:rFonts w:ascii="Arial" w:hAnsi="Arial" w:cs="Arial"/>
-          <w:sz w:val="14"/>
-          <w:szCs w:val="14"/>
-        </w:rPr>
         <w:t xml:space="preserve">no presenta saldo deudor ante </w:t>
       </w:r>
       <w:r>
@@ -2859,31 +2815,28 @@
           <w:sz w:val="14"/>
           <w:szCs w:val="14"/>
         </w:rPr>
-        <w:t xml:space="preserve"> instituto a partir del día</w:t>
-      </w:r>
-      <w:r>
-        <w:rPr>
-          <w:rFonts w:ascii="Arial" w:hAnsi="Arial" w:cs="Arial"/>
-          <w:sz w:val="14"/>
-          <w:szCs w:val="14"/>
-        </w:rPr>
-        <w:t xml:space="preserve">                  </w:t>
-      </w:r>
-      <w:r>
-        <w:rPr>
-          <w:rFonts w:ascii="Arial" w:hAnsi="Arial" w:cs="Arial"/>
-          <w:sz w:val="14"/>
-          <w:szCs w:val="14"/>
-        </w:rPr>
-        <w:t xml:space="preserve"> </w:t>
-      </w:r>
-      <w:r>
-        <w:rPr>
-          <w:rFonts w:ascii="Arial" w:hAnsi="Arial" w:cs="Arial"/>
-          <w:sz w:val="14"/>
-          <w:szCs w:val="14"/>
-        </w:rPr>
-        <w:t>.</w:t>
+        <w:t xml:space="preserve"> instituto a partir del día {{ fecha_liquidacion }}.</w:t>
+      </w:r>
+      <w:r>
+        <w:rPr>
+          <w:rFonts w:ascii="Arial" w:hAnsi="Arial" w:cs="Arial"/>
+          <w:sz w:val="14"/>
+          <w:szCs w:val="14"/>
+        </w:rPr>
+      </w:r>
+      <w:r>
+        <w:rPr>
+          <w:rFonts w:ascii="Arial" w:hAnsi="Arial" w:cs="Arial"/>
+          <w:sz w:val="14"/>
+          <w:szCs w:val="14"/>
+        </w:rPr>
+      </w:r>
+      <w:r>
+        <w:rPr>
+          <w:rFonts w:ascii="Arial" w:hAnsi="Arial" w:cs="Arial"/>
+          <w:sz w:val="14"/>
+          <w:szCs w:val="14"/>
+        </w:rPr>
       </w:r>
       <w:r>
         <w:rPr>
@@ -3006,23 +2959,22 @@
           <w:sz w:val="14"/>
           <w:szCs w:val="14"/>
         </w:rPr>
-        <w:t>Con fecha</w:t>
-      </w:r>
-      <w:r>
-        <w:rPr>
-          <w:rFonts w:ascii="Arial" w:hAnsi="Arial" w:cs="Arial"/>
-          <w:sz w:val="14"/>
-          <w:szCs w:val="14"/>
-        </w:rPr>
-        <w:t xml:space="preserve">          </w:t>
-      </w:r>
-      <w:r>
-        <w:rPr>
-          <w:rFonts w:ascii="Arial" w:hAnsi="Arial" w:cs="Arial"/>
-          <w:sz w:val="14"/>
-          <w:szCs w:val="14"/>
-        </w:rPr>
-        <w:t xml:space="preserve">, el </w:t>
+        <w:t>Con fecha {{ fecha_expedicion_2 }},</w:t>
+      </w:r>
+      <w:r>
+        <w:rPr>
+          <w:rFonts w:ascii="Arial" w:hAnsi="Arial" w:cs="Arial"/>
+          <w:sz w:val="14"/>
+          <w:szCs w:val="14"/>
+        </w:rPr>
+      </w:r>
+      <w:r>
+        <w:rPr>
+          <w:rFonts w:ascii="Arial" w:hAnsi="Arial" w:cs="Arial"/>
+          <w:sz w:val="14"/>
+          <w:szCs w:val="14"/>
+        </w:rPr>
+        <w:t xml:space="preserve"> el </w:t>
       </w:r>
       <w:r>
         <w:rPr>
@@ -3047,31 +2999,80 @@
           <w:sz w:val="14"/>
           <w:szCs w:val="14"/>
         </w:rPr>
-        <w:t xml:space="preserve"> el número</w:t>
-      </w:r>
-      <w:r>
-        <w:rPr>
-          <w:rFonts w:ascii="Arial" w:hAnsi="Arial" w:cs="Arial"/>
-          <w:sz w:val="14"/>
-          <w:szCs w:val="14"/>
-        </w:rPr>
-        <w:t>“</w:t>
-      </w:r>
-      <w:r>
-        <w:rPr>
-          <w:rFonts w:ascii="Arial" w:hAnsi="Arial" w:cs="Arial"/>
-          <w:sz w:val="14"/>
-          <w:szCs w:val="14"/>
-        </w:rPr>
-        <w:t xml:space="preserve">            </w:t>
-      </w:r>
-      <w:r>
-        <w:rPr>
-          <w:rFonts w:ascii="Arial" w:hAnsi="Arial" w:cs="Arial"/>
-          <w:sz w:val="14"/>
-          <w:szCs w:val="14"/>
-        </w:rPr>
-        <w:t>”</w:t>
+        <w:t xml:space="preserve"> el número {{ numero_carta_2 }}</w:t>
+      </w:r>
+      <w:r>
+        <w:rPr>
+          <w:rFonts w:ascii="Arial" w:hAnsi="Arial" w:cs="Arial"/>
+          <w:sz w:val="14"/>
+          <w:szCs w:val="14"/>
+        </w:rPr>
+      </w:r>
+      <w:r>
+        <w:rPr>
+          <w:rFonts w:ascii="Arial" w:hAnsi="Arial" w:cs="Arial"/>
+          <w:sz w:val="14"/>
+          <w:szCs w:val="14"/>
+        </w:rPr>
+      </w:r>
+      <w:r>
+        <w:rPr>
+          <w:rFonts w:ascii="Arial" w:hAnsi="Arial" w:cs="Arial"/>
+          <w:sz w:val="14"/>
+          <w:szCs w:val="14"/>
+        </w:rPr>
+      </w:r>
+      <w:r>
+        <w:rPr>
+          <w:rFonts w:ascii="Arial" w:hAnsi="Arial" w:cs="Arial"/>
+          <w:sz w:val="14"/>
+          <w:szCs w:val="14"/>
+        </w:rPr>
+      </w:r>
+      <w:r>
+        <w:rPr>
+          <w:rFonts w:ascii="Arial" w:hAnsi="Arial" w:cs="Arial"/>
+          <w:sz w:val="14"/>
+          <w:szCs w:val="14"/>
+        </w:rPr>
+      </w:r>
+      <w:r>
+        <w:rPr>
+          <w:rFonts w:ascii="Arial" w:hAnsi="Arial" w:cs="Arial"/>
+          <w:sz w:val="14"/>
+          <w:szCs w:val="14"/>
+        </w:rPr>
+      </w:r>
+      <w:r>
+        <w:rPr>
+          <w:rFonts w:ascii="Arial" w:hAnsi="Arial" w:cs="Arial"/>
+          <w:sz w:val="14"/>
+          <w:szCs w:val="14"/>
+        </w:rPr>
+      </w:r>
+      <w:r>
+        <w:rPr>
+          <w:rFonts w:ascii="Arial" w:hAnsi="Arial" w:cs="Arial"/>
+          <w:sz w:val="14"/>
+          <w:szCs w:val="14"/>
+        </w:rPr>
+        <w:t>,</w:t>
+      </w:r>
+      <w:r>
+        <w:rPr>
+          <w:rFonts w:ascii="Arial" w:hAnsi="Arial" w:cs="Arial"/>
+          <w:sz w:val="14"/>
+          <w:szCs w:val="14"/>
+        </w:rPr>
+        <w:t xml:space="preserve"> al suscrito Notario para la realización del presente instrumento </w:t>
+      </w:r>
+      <w:r>
+        <w:rPr>
+          <w:rFonts w:ascii="Arial" w:hAnsi="Arial" w:cs="Arial"/>
+          <w:sz w:val="14"/>
+          <w:szCs w:val="14"/>
+        </w:rPr>
+        <w:t>en donde se menciona que el crédito relacionado en el antecedente uno romano de este instrumento</w:t>
       </w:r>
       <w:r>
         <w:rPr>
@@ -3087,96 +3088,39 @@
           <w:sz w:val="14"/>
           <w:szCs w:val="14"/>
         </w:rPr>
-        <w:t>(</w:t>
-      </w:r>
-      <w:r>
-        <w:rPr>
-          <w:rFonts w:ascii="Arial" w:hAnsi="Arial" w:cs="Arial"/>
-          <w:sz w:val="14"/>
-          <w:szCs w:val="14"/>
-        </w:rPr>
-        <w:t xml:space="preserve">                                      </w:t>
-      </w:r>
-      <w:r>
-        <w:rPr>
-          <w:rFonts w:ascii="Arial" w:hAnsi="Arial" w:cs="Arial"/>
-          <w:sz w:val="14"/>
-          <w:szCs w:val="14"/>
-        </w:rPr>
-        <w:t>)</w:t>
-      </w:r>
-      <w:r>
-        <w:rPr>
-          <w:rFonts w:ascii="Arial" w:hAnsi="Arial" w:cs="Arial"/>
-          <w:sz w:val="14"/>
-          <w:szCs w:val="14"/>
-        </w:rPr>
-        <w:t>,</w:t>
-      </w:r>
-      <w:r>
-        <w:rPr>
-          <w:rFonts w:ascii="Arial" w:hAnsi="Arial" w:cs="Arial"/>
-          <w:sz w:val="14"/>
-          <w:szCs w:val="14"/>
-        </w:rPr>
-        <w:t xml:space="preserve"> al suscrito Notario para la realización del presente instrumento </w:t>
-      </w:r>
-      <w:r>
-        <w:rPr>
-          <w:rFonts w:ascii="Arial" w:hAnsi="Arial" w:cs="Arial"/>
-          <w:sz w:val="14"/>
-          <w:szCs w:val="14"/>
-        </w:rPr>
-        <w:t>en donde se menciona que el crédito relacionado en el antecedente uno romano de este instrumento</w:t>
-      </w:r>
-      <w:r>
-        <w:rPr>
-          <w:rFonts w:ascii="Arial" w:hAnsi="Arial" w:cs="Arial"/>
+        <w:t xml:space="preserve">no presenta saldo deudor ante </w:t>
+      </w:r>
+      <w:r>
+        <w:rPr>
+          <w:rFonts w:ascii="Arial" w:hAnsi="Arial" w:cs="Arial"/>
+          <w:sz w:val="14"/>
+          <w:szCs w:val="14"/>
+        </w:rPr>
+        <w:t>dicho</w:t>
+      </w:r>
+      <w:r>
+        <w:rPr>
+          <w:rFonts w:ascii="Arial" w:hAnsi="Arial" w:cs="Arial"/>
+          <w:sz w:val="14"/>
+          <w:szCs w:val="14"/>
+        </w:rPr>
+        <w:t xml:space="preserve"> instituto a partir del día {{ fecha_liquidacion_2 }}.</w:t>
+      </w:r>
+      <w:r>
+        <w:rPr>
+          <w:rFonts w:ascii="Arial" w:hAnsi="Arial" w:cs="Arial"/>
+          <w:sz w:val="14"/>
+          <w:szCs w:val="14"/>
+        </w:rPr>
+      </w:r>
+      <w:r>
+        <w:rPr>
+          <w:rFonts w:ascii="Arial" w:hAnsi="Arial" w:cs="Arial"/>
+          <w:b/>
           <w:sz w:val="14"/>
           <w:szCs w:val="14"/>
         </w:rPr>
         <w:t xml:space="preserve"> </w:t>
-      </w:r>
-      <w:r>
-        <w:rPr>
-          <w:rFonts w:ascii="Arial" w:hAnsi="Arial" w:cs="Arial"/>
-          <w:sz w:val="14"/>
-          <w:szCs w:val="14"/>
-        </w:rPr>
-        <w:t xml:space="preserve">no presenta saldo deudor ante </w:t>
-      </w:r>
-      <w:r>
-        <w:rPr>
-          <w:rFonts w:ascii="Arial" w:hAnsi="Arial" w:cs="Arial"/>
-          <w:sz w:val="14"/>
-          <w:szCs w:val="14"/>
-        </w:rPr>
-        <w:t>dicho</w:t>
-      </w:r>
-      <w:r>
-        <w:rPr>
-          <w:rFonts w:ascii="Arial" w:hAnsi="Arial" w:cs="Arial"/>
-          <w:sz w:val="14"/>
-          <w:szCs w:val="14"/>
-        </w:rPr>
-        <w:t xml:space="preserve"> instituto a partir del día</w:t>
-      </w:r>
-      <w:r>
-        <w:rPr>
-          <w:rFonts w:ascii="Arial" w:hAnsi="Arial" w:cs="Arial"/>
-          <w:sz w:val="14"/>
-          <w:szCs w:val="14"/>
-        </w:rPr>
-        <w:t xml:space="preserve">                                   </w:t>
-      </w:r>
-      <w:r>
-        <w:rPr>
-          <w:rFonts w:ascii="Arial" w:hAnsi="Arial" w:cs="Arial"/>
-          <w:b/>
-          <w:sz w:val="14"/>
-          <w:szCs w:val="14"/>
-        </w:rPr>
-        <w:t xml:space="preserve">. </w:t>
       </w:r>
       <w:r>
         <w:rPr>
@@ -3818,21 +3762,80 @@
           <w:sz w:val="14"/>
           <w:szCs w:val="14"/>
         </w:rPr>
-        <w:t>crédito</w:t>
-      </w:r>
-      <w:r>
-        <w:rPr>
-          <w:rFonts w:ascii="Arial" w:hAnsi="Arial" w:cs="Arial"/>
-          <w:bCs/>
-          <w:sz w:val="14"/>
-          <w:szCs w:val="14"/>
-        </w:rPr>
-        <w:t xml:space="preserve"> </w:t>
-      </w:r>
-      <w:r>
-        <w:rPr>
-          <w:rFonts w:ascii="Arial" w:hAnsi="Arial" w:cs="Arial"/>
-          <w:bCs/>
+        <w:t>crédito {{ numero_credito }}</w:t>
+      </w:r>
+      <w:r>
+        <w:rPr>
+          <w:rFonts w:ascii="Arial" w:hAnsi="Arial" w:cs="Arial"/>
+          <w:bCs/>
+          <w:sz w:val="14"/>
+          <w:szCs w:val="14"/>
+        </w:rPr>
+      </w:r>
+      <w:r>
+        <w:rPr>
+          <w:rFonts w:ascii="Arial" w:hAnsi="Arial" w:cs="Arial"/>
+          <w:bCs/>
+          <w:sz w:val="14"/>
+          <w:szCs w:val="14"/>
+        </w:rPr>
+      </w:r>
+      <w:r>
+        <w:rPr>
+          <w:rFonts w:ascii="Arial" w:hAnsi="Arial" w:cs="Arial"/>
+          <w:bCs/>
+          <w:sz w:val="14"/>
+          <w:szCs w:val="14"/>
+        </w:rPr>
+      </w:r>
+      <w:r>
+        <w:rPr>
+          <w:rFonts w:ascii="Arial" w:hAnsi="Arial" w:cs="Arial"/>
+          <w:bCs/>
+          <w:sz w:val="14"/>
+          <w:szCs w:val="14"/>
+        </w:rPr>
+      </w:r>
+      <w:r>
+        <w:rPr>
+          <w:rFonts w:ascii="Arial" w:hAnsi="Arial" w:cs="Arial"/>
+          <w:bCs/>
+          <w:sz w:val="14"/>
+          <w:szCs w:val="14"/>
+        </w:rPr>
+      </w:r>
+      <w:r>
+        <w:rPr>
+          <w:rFonts w:ascii="Arial" w:hAnsi="Arial" w:cs="Arial"/>
+          <w:sz w:val="14"/>
+          <w:szCs w:val="14"/>
+        </w:rPr>
+      </w:r>
+      <w:r>
+        <w:rPr>
+          <w:rFonts w:ascii="Arial" w:hAnsi="Arial" w:cs="Arial"/>
+          <w:sz w:val="14"/>
+          <w:szCs w:val="14"/>
+        </w:rPr>
+      </w:r>
+      <w:r>
+        <w:rPr>
+          <w:rFonts w:ascii="Arial" w:hAnsi="Arial" w:cs="Arial"/>
+          <w:sz w:val="14"/>
+          <w:szCs w:val="14"/>
+        </w:rPr>
+      </w:r>
+      <w:r>
+        <w:rPr>
+          <w:rFonts w:ascii="Arial" w:hAnsi="Arial" w:cs="Arial"/>
+          <w:sz w:val="14"/>
+          <w:szCs w:val="14"/>
+        </w:rPr>
+        <w:t xml:space="preserve"> del </w:t>
+      </w:r>
+      <w:r>
+        <w:rPr>
+          <w:rFonts w:ascii="Arial" w:hAnsi="Arial" w:cs="Arial"/>
           <w:sz w:val="14"/>
           <w:szCs w:val="14"/>
         </w:rPr>
@@ -3841,15 +3844,17 @@
       <w:r>
         <w:rPr>
           <w:rFonts w:ascii="Arial" w:hAnsi="Arial" w:cs="Arial"/>
-          <w:bCs/>
-          <w:sz w:val="14"/>
-          <w:szCs w:val="14"/>
-        </w:rPr>
-        <w:t xml:space="preserve">               </w:t>
-      </w:r>
-      <w:r>
-        <w:rPr>
-          <w:rFonts w:ascii="Arial" w:hAnsi="Arial" w:cs="Arial"/>
+          <w:b/>
+          <w:bCs/>
+          <w:sz w:val="14"/>
+          <w:szCs w:val="14"/>
+        </w:rPr>
+        <w:t>TRABAJADOR UNO</w:t>
+      </w:r>
+      <w:r>
+        <w:rPr>
+          <w:rFonts w:ascii="Arial" w:hAnsi="Arial" w:cs="Arial"/>
+          <w:b/>
           <w:bCs/>
           <w:sz w:val="14"/>
           <w:szCs w:val="14"/>
@@ -3859,75 +3864,6 @@
       <w:r>
         <w:rPr>
           <w:rFonts w:ascii="Arial" w:hAnsi="Arial" w:cs="Arial"/>
-          <w:bCs/>
-          <w:sz w:val="14"/>
-          <w:szCs w:val="14"/>
-        </w:rPr>
-        <w:t xml:space="preserve"> </w:t>
-      </w:r>
-      <w:r>
-        <w:rPr>
-          <w:rFonts w:ascii="Arial" w:hAnsi="Arial" w:cs="Arial"/>
-          <w:sz w:val="14"/>
-          <w:szCs w:val="14"/>
-        </w:rPr>
-        <w:t>(</w:t>
-      </w:r>
-      <w:r>
-        <w:rPr>
-          <w:rFonts w:ascii="Arial" w:hAnsi="Arial" w:cs="Arial"/>
-          <w:sz w:val="14"/>
-          <w:szCs w:val="14"/>
-        </w:rPr>
-        <w:t xml:space="preserve">                                         </w:t>
-      </w:r>
-      <w:r>
-        <w:rPr>
-          <w:rFonts w:ascii="Arial" w:hAnsi="Arial" w:cs="Arial"/>
-          <w:sz w:val="14"/>
-          <w:szCs w:val="14"/>
-        </w:rPr>
-        <w:t>)</w:t>
-      </w:r>
-      <w:r>
-        <w:rPr>
-          <w:rFonts w:ascii="Arial" w:hAnsi="Arial" w:cs="Arial"/>
-          <w:sz w:val="14"/>
-          <w:szCs w:val="14"/>
-        </w:rPr>
-        <w:t xml:space="preserve"> del </w:t>
-      </w:r>
-      <w:r>
-        <w:rPr>
-          <w:rFonts w:ascii="Arial" w:hAnsi="Arial" w:cs="Arial"/>
-          <w:sz w:val="14"/>
-          <w:szCs w:val="14"/>
-        </w:rPr>
-        <w:t>“</w:t>
-      </w:r>
-      <w:r>
-        <w:rPr>
-          <w:rFonts w:ascii="Arial" w:hAnsi="Arial" w:cs="Arial"/>
-          <w:b/>
-          <w:bCs/>
-          <w:sz w:val="14"/>
-          <w:szCs w:val="14"/>
-        </w:rPr>
-        <w:t>TRABAJADOR UNO</w:t>
-      </w:r>
-      <w:r>
-        <w:rPr>
-          <w:rFonts w:ascii="Arial" w:hAnsi="Arial" w:cs="Arial"/>
-          <w:b/>
-          <w:bCs/>
-          <w:sz w:val="14"/>
-          <w:szCs w:val="14"/>
-        </w:rPr>
-        <w:t>”</w:t>
-      </w:r>
-      <w:r>
-        <w:rPr>
-          <w:rFonts w:ascii="Arial" w:hAnsi="Arial" w:cs="Arial"/>
           <w:sz w:val="14"/>
           <w:szCs w:val="14"/>
         </w:rPr>
@@ -3939,58 +3875,52 @@
           <w:sz w:val="14"/>
           <w:szCs w:val="14"/>
         </w:rPr>
-        <w:t>“</w:t>
-      </w:r>
-      <w:r>
-        <w:rPr>
-          <w:rFonts w:ascii="Arial" w:hAnsi="Arial" w:cs="Arial"/>
-          <w:bCs/>
-          <w:sz w:val="14"/>
-          <w:szCs w:val="14"/>
-        </w:rPr>
-        <w:t xml:space="preserve">                 </w:t>
-      </w:r>
-      <w:r>
-        <w:rPr>
-          <w:rFonts w:ascii="Arial" w:hAnsi="Arial" w:cs="Arial"/>
-          <w:bCs/>
-          <w:sz w:val="14"/>
-          <w:szCs w:val="14"/>
-        </w:rPr>
-        <w:t>”</w:t>
-      </w:r>
-      <w:r>
-        <w:rPr>
-          <w:rFonts w:ascii="Arial" w:hAnsi="Arial" w:cs="Arial"/>
-          <w:bCs/>
-          <w:sz w:val="14"/>
-          <w:szCs w:val="14"/>
-        </w:rPr>
-        <w:t xml:space="preserve"> </w:t>
-      </w:r>
-      <w:r>
-        <w:rPr>
-          <w:rFonts w:ascii="Arial" w:hAnsi="Arial" w:cs="Arial"/>
-          <w:sz w:val="14"/>
-          <w:szCs w:val="14"/>
-        </w:rPr>
-        <w:t>(</w:t>
-      </w:r>
-      <w:r>
-        <w:rPr>
-          <w:rFonts w:ascii="Arial" w:hAnsi="Arial" w:cs="Arial"/>
-          <w:sz w:val="14"/>
-          <w:szCs w:val="14"/>
-        </w:rPr>
-        <w:t xml:space="preserve">                     </w:t>
-      </w:r>
-      <w:r>
-        <w:rPr>
-          <w:rFonts w:ascii="Arial" w:hAnsi="Arial" w:cs="Arial"/>
-          <w:sz w:val="14"/>
-          <w:szCs w:val="14"/>
-        </w:rPr>
-        <w:t>)</w:t>
+        <w:t>{{ numero_credito_2 }}</w:t>
+      </w:r>
+      <w:r>
+        <w:rPr>
+          <w:rFonts w:ascii="Arial" w:hAnsi="Arial" w:cs="Arial"/>
+          <w:bCs/>
+          <w:sz w:val="14"/>
+          <w:szCs w:val="14"/>
+        </w:rPr>
+      </w:r>
+      <w:r>
+        <w:rPr>
+          <w:rFonts w:ascii="Arial" w:hAnsi="Arial" w:cs="Arial"/>
+          <w:bCs/>
+          <w:sz w:val="14"/>
+          <w:szCs w:val="14"/>
+        </w:rPr>
+      </w:r>
+      <w:r>
+        <w:rPr>
+          <w:rFonts w:ascii="Arial" w:hAnsi="Arial" w:cs="Arial"/>
+          <w:bCs/>
+          <w:sz w:val="14"/>
+          <w:szCs w:val="14"/>
+        </w:rPr>
+      </w:r>
+      <w:r>
+        <w:rPr>
+          <w:rFonts w:ascii="Arial" w:hAnsi="Arial" w:cs="Arial"/>
+          <w:sz w:val="14"/>
+          <w:szCs w:val="14"/>
+        </w:rPr>
+      </w:r>
+      <w:r>
+        <w:rPr>
+          <w:rFonts w:ascii="Arial" w:hAnsi="Arial" w:cs="Arial"/>
+          <w:sz w:val="14"/>
+          <w:szCs w:val="14"/>
+        </w:rPr>
+      </w:r>
+      <w:r>
+        <w:rPr>
+          <w:rFonts w:ascii="Arial" w:hAnsi="Arial" w:cs="Arial"/>
+          <w:sz w:val="14"/>
+          <w:szCs w:val="14"/>
+        </w:rPr>
       </w:r>
       <w:r>
         <w:rPr>
@@ -6140,15 +6070,14 @@
           <w:sz w:val="14"/>
           <w:szCs w:val="14"/>
         </w:rPr>
-        <w:t>LOS SEÑORES</w:t>
-      </w:r>
-      <w:r>
-        <w:rPr>
-          <w:rFonts w:ascii="Arial" w:hAnsi="Arial" w:cs="Arial"/>
-          <w:sz w:val="14"/>
-          <w:szCs w:val="14"/>
-        </w:rPr>
-        <w:t xml:space="preserve"> </w:t>
+        <w:t xml:space="preserve">LOS SEÑORES {{ nombre_acreditado }} Y {{ nombre_acreditado_2 }}, </w:t>
+      </w:r>
+      <w:r>
+        <w:rPr>
+          <w:rFonts w:ascii="Arial" w:hAnsi="Arial" w:cs="Arial"/>
+          <w:sz w:val="14"/>
+          <w:szCs w:val="14"/>
+        </w:rPr>
       </w:r>
       <w:r>
         <w:rPr>
@@ -6160,7 +6089,6 @@
           <w:u w:val="single"/>
           <w:lang w:val="es-ES"/>
         </w:rPr>
-        <w:t xml:space="preserve">                             </w:t>
       </w:r>
       <w:r>
         <w:rPr>
@@ -6171,7 +6099,6 @@
           <w:szCs w:val="14"/>
           <w:lang w:val="es-ES"/>
         </w:rPr>
-        <w:t>,</w:t>
       </w:r>
       <w:r>
         <w:rPr>
@@ -6182,7 +6109,6 @@
           <w:szCs w:val="14"/>
           <w:lang w:val="es-ES"/>
         </w:rPr>
-        <w:t xml:space="preserve"> </w:t>
       </w:r>
       <w:r>
         <w:rPr>
@@ -6193,7 +6119,6 @@
           <w:szCs w:val="14"/>
           <w:lang w:val="es-ES"/>
         </w:rPr>
-        <w:t xml:space="preserve">             </w:t>
       </w:r>
       <w:r>
         <w:rPr>

</xml_diff>